<commit_message>
Update(Practical Exam): PE MMA301
</commit_message>
<xml_diff>
--- a/PE_MMA301_VoDaiVy/PRACTICAL_EXAMINATION_VoDaiVy.docx
+++ b/PE_MMA301_VoDaiVy/PRACTICAL_EXAMINATION_VoDaiVy.docx
@@ -1061,8 +1061,8 @@
           <w:lang w:val="vi-VN"/>
         </w:rPr>
         <w:drawing>
-          <wp:inline distT="0" distB="0" distL="0" distR="0" wp14:anchorId="13CD8F3A" wp14:editId="4FFC5812">
-            <wp:extent cx="1073485" cy="2272145"/>
+          <wp:inline distT="0" distB="0" distL="0" distR="0" wp14:anchorId="13CD8F3A" wp14:editId="50DA061C">
+            <wp:extent cx="1073431" cy="2272030"/>
             <wp:effectExtent l="0" t="0" r="6350" b="1270"/>
             <wp:docPr id="74053754" name="Picture 1"/>
             <wp:cNvGraphicFramePr>
@@ -1084,7 +1084,7 @@
                   <pic:spPr>
                     <a:xfrm>
                       <a:off x="0" y="0"/>
-                      <a:ext cx="1114229" cy="2358383"/>
+                      <a:ext cx="1077302" cy="2280223"/>
                     </a:xfrm>
                     <a:prstGeom prst="rect">
                       <a:avLst/>
@@ -1113,10 +1113,10 @@
           <w:lang w:val="vi-VN"/>
         </w:rPr>
         <w:drawing>
-          <wp:inline distT="0" distB="0" distL="0" distR="0" wp14:anchorId="68A72209" wp14:editId="1CBB9B69">
-            <wp:extent cx="1072749" cy="2270589"/>
-            <wp:effectExtent l="0" t="0" r="0" b="3175"/>
-            <wp:docPr id="1585912388" name="Picture 1"/>
+          <wp:inline distT="0" distB="0" distL="0" distR="0" wp14:anchorId="5BC5F32B" wp14:editId="70B174C4">
+            <wp:extent cx="1076286" cy="2261287"/>
+            <wp:effectExtent l="0" t="0" r="3810" b="0"/>
+            <wp:docPr id="369623338" name="Picture 1"/>
             <wp:cNvGraphicFramePr>
               <a:graphicFrameLocks xmlns:a="http://schemas.openxmlformats.org/drawingml/2006/main" noChangeAspect="1"/>
             </wp:cNvGraphicFramePr>
@@ -1124,7 +1124,7 @@
               <a:graphicData uri="http://schemas.openxmlformats.org/drawingml/2006/picture">
                 <pic:pic xmlns:pic="http://schemas.openxmlformats.org/drawingml/2006/picture">
                   <pic:nvPicPr>
-                    <pic:cNvPr id="1585912388" name=""/>
+                    <pic:cNvPr id="369623338" name=""/>
                     <pic:cNvPicPr/>
                   </pic:nvPicPr>
                   <pic:blipFill>
@@ -1136,7 +1136,7 @@
                   <pic:spPr>
                     <a:xfrm>
                       <a:off x="0" y="0"/>
-                      <a:ext cx="1082437" cy="2291095"/>
+                      <a:ext cx="1098963" cy="2308931"/>
                     </a:xfrm>
                     <a:prstGeom prst="rect">
                       <a:avLst/>
@@ -1165,9 +1165,9 @@
           <w:lang w:val="vi-VN"/>
         </w:rPr>
         <w:drawing>
-          <wp:inline distT="0" distB="0" distL="0" distR="0" wp14:anchorId="5486B3A9" wp14:editId="7B517D11">
-            <wp:extent cx="3027901" cy="1797978"/>
-            <wp:effectExtent l="0" t="0" r="0" b="5715"/>
+          <wp:inline distT="0" distB="0" distL="0" distR="0" wp14:anchorId="5486B3A9" wp14:editId="250C3A1D">
+            <wp:extent cx="2940908" cy="1746322"/>
+            <wp:effectExtent l="0" t="0" r="5715" b="0"/>
             <wp:docPr id="1888349396" name="Picture 1"/>
             <wp:cNvGraphicFramePr>
               <a:graphicFrameLocks xmlns:a="http://schemas.openxmlformats.org/drawingml/2006/main" noChangeAspect="1"/>
@@ -1188,7 +1188,7 @@
                   <pic:spPr>
                     <a:xfrm>
                       <a:off x="0" y="0"/>
-                      <a:ext cx="3097811" cy="1839491"/>
+                      <a:ext cx="3012643" cy="1788919"/>
                     </a:xfrm>
                     <a:prstGeom prst="rect">
                       <a:avLst/>

</xml_diff>